<commit_message>
matching template with script logic
</commit_message>
<xml_diff>
--- a/templates/template_entry_level.docx
+++ b/templates/template_entry_level.docx
@@ -323,7 +323,25 @@
           <w:sz w:val="21"/>
           <w:szCs w:val="21"/>
         </w:rPr>
-        <w:t>{#location}, {location}{/location}</w:t>
+        <w:t>{#location}</w:t>
+      </w:r>
+      <w:r>
+        <w:rPr>
+          <w:rFonts w:cs="Segoe UI"/>
+          <w:color w:val="1A2634"/>
+          <w:sz w:val="21"/>
+          <w:szCs w:val="21"/>
+        </w:rPr>
+        <w:t xml:space="preserve"> |</w:t>
+      </w:r>
+      <w:r>
+        <w:rPr>
+          <w:rFonts w:cs="Segoe UI"/>
+          <w:color w:val="1A2634"/>
+          <w:sz w:val="21"/>
+          <w:szCs w:val="21"/>
+        </w:rPr>
+        <w:t xml:space="preserve"> {location}{/location}</w:t>
       </w:r>
     </w:p>
     <w:p>
@@ -373,27 +391,7 @@
           <w:szCs w:val="21"/>
         </w:rPr>
         <w:br/>
-        <w:t>{/</w:t>
-      </w:r>
-      <w:proofErr w:type="spellStart"/>
-      <w:r>
-        <w:rPr>
-          <w:rFonts w:cs="Segoe UI"/>
-          <w:color w:val="1A2634"/>
-          <w:sz w:val="21"/>
-          <w:szCs w:val="21"/>
-        </w:rPr>
-        <w:t>edu_competencies</w:t>
-      </w:r>
-      <w:proofErr w:type="spellEnd"/>
-      <w:r>
-        <w:rPr>
-          <w:rFonts w:cs="Segoe UI"/>
-          <w:color w:val="1A2634"/>
-          <w:sz w:val="21"/>
-          <w:szCs w:val="21"/>
-        </w:rPr>
-        <w:t>}</w:t>
+        <w:t>{/edu_competencies}</w:t>
       </w:r>
       <w:r>
         <w:rPr>
@@ -422,27 +420,7 @@
           <w:szCs w:val="21"/>
         </w:rPr>
         <w:br/>
-        <w:t>{</w:t>
-      </w:r>
-      <w:proofErr w:type="spellStart"/>
-      <w:r>
-        <w:rPr>
-          <w:rFonts w:cs="Segoe UI"/>
-          <w:color w:val="1A2634"/>
-          <w:sz w:val="21"/>
-          <w:szCs w:val="21"/>
-        </w:rPr>
-        <w:t>edu_detail</w:t>
-      </w:r>
-      <w:proofErr w:type="spellEnd"/>
-      <w:r>
-        <w:rPr>
-          <w:rFonts w:cs="Segoe UI"/>
-          <w:color w:val="1A2634"/>
-          <w:sz w:val="21"/>
-          <w:szCs w:val="21"/>
-        </w:rPr>
-        <w:t>}</w:t>
+        <w:t>{edu_detail}</w:t>
       </w:r>
       <w:r>
         <w:rPr>
@@ -452,27 +430,7 @@
           <w:szCs w:val="21"/>
         </w:rPr>
         <w:br/>
-        <w:t>{/</w:t>
-      </w:r>
-      <w:proofErr w:type="spellStart"/>
-      <w:r>
-        <w:rPr>
-          <w:rFonts w:cs="Segoe UI"/>
-          <w:color w:val="1A2634"/>
-          <w:sz w:val="21"/>
-          <w:szCs w:val="21"/>
-        </w:rPr>
-        <w:t>edu_detail</w:t>
-      </w:r>
-      <w:proofErr w:type="spellEnd"/>
-      <w:r>
-        <w:rPr>
-          <w:rFonts w:cs="Segoe UI"/>
-          <w:color w:val="1A2634"/>
-          <w:sz w:val="21"/>
-          <w:szCs w:val="21"/>
-        </w:rPr>
-        <w:t>}</w:t>
+        <w:t>{/edu_detail}</w:t>
       </w:r>
       <w:r>
         <w:rPr>
@@ -492,15 +450,6 @@
         </w:rPr>
         <w:br/>
         <w:t>{/education}</w:t>
-      </w:r>
-      <w:r>
-        <w:rPr>
-          <w:rFonts w:cs="Segoe UI"/>
-          <w:color w:val="1A2634"/>
-          <w:sz w:val="21"/>
-          <w:szCs w:val="21"/>
-        </w:rPr>
-        <w:t>}</w:t>
       </w:r>
     </w:p>
     <w:p>
@@ -644,71 +593,27 @@
           <w:sz w:val="21"/>
           <w:szCs w:val="21"/>
         </w:rPr>
-        <w:t>{</w:t>
-      </w:r>
-      <w:proofErr w:type="spellStart"/>
-      <w:r>
-        <w:rPr>
-          <w:rFonts w:cs="Segoe UI"/>
-          <w:b/>
-          <w:bCs/>
-          <w:color w:val="1A2634"/>
-          <w:sz w:val="21"/>
-          <w:szCs w:val="21"/>
-        </w:rPr>
-        <w:t>project_title</w:t>
-      </w:r>
-      <w:proofErr w:type="spellEnd"/>
-      <w:r>
-        <w:rPr>
-          <w:rFonts w:cs="Segoe UI"/>
-          <w:b/>
-          <w:bCs/>
-          <w:color w:val="1A2634"/>
-          <w:sz w:val="21"/>
-          <w:szCs w:val="21"/>
-        </w:rPr>
-        <w:t>}</w:t>
-      </w:r>
-    </w:p>
-    <w:p>
-      <w:pPr>
-        <w:spacing w:after="60" w:line="22" w:lineRule="atLeast"/>
-        <w:rPr>
-          <w:rFonts w:cs="Segoe UI"/>
-          <w:color w:val="1A2634"/>
-          <w:sz w:val="21"/>
-          <w:szCs w:val="21"/>
-        </w:rPr>
-      </w:pPr>
-      <w:r>
-        <w:rPr>
-          <w:rFonts w:cs="Segoe UI"/>
-          <w:color w:val="1A2634"/>
-          <w:sz w:val="21"/>
-          <w:szCs w:val="21"/>
-        </w:rPr>
-        <w:t>{start} – {</w:t>
-      </w:r>
-      <w:proofErr w:type="spellStart"/>
-      <w:r>
-        <w:rPr>
-          <w:rFonts w:cs="Segoe UI"/>
-          <w:color w:val="1A2634"/>
-          <w:sz w:val="21"/>
-          <w:szCs w:val="21"/>
-        </w:rPr>
-        <w:t>end_or_present</w:t>
-      </w:r>
-      <w:proofErr w:type="spellEnd"/>
-      <w:r>
-        <w:rPr>
-          <w:rFonts w:cs="Segoe UI"/>
-          <w:color w:val="1A2634"/>
-          <w:sz w:val="21"/>
-          <w:szCs w:val="21"/>
-        </w:rPr>
-        <w:t>}</w:t>
+        <w:t>{project_title}</w:t>
+      </w:r>
+    </w:p>
+    <w:p>
+      <w:pPr>
+        <w:spacing w:after="60" w:line="22" w:lineRule="atLeast"/>
+        <w:rPr>
+          <w:rFonts w:cs="Segoe UI"/>
+          <w:color w:val="1A2634"/>
+          <w:sz w:val="21"/>
+          <w:szCs w:val="21"/>
+        </w:rPr>
+      </w:pPr>
+      <w:r>
+        <w:rPr>
+          <w:rFonts w:cs="Segoe UI"/>
+          <w:color w:val="1A2634"/>
+          <w:sz w:val="21"/>
+          <w:szCs w:val="21"/>
+        </w:rPr>
+        <w:t>{start} – {end_or_present}</w:t>
       </w:r>
     </w:p>
     <w:p>
@@ -748,67 +653,27 @@
           <w:sz w:val="21"/>
           <w:szCs w:val="21"/>
         </w:rPr>
-        <w:t>{</w:t>
-      </w:r>
-      <w:proofErr w:type="spellStart"/>
-      <w:r>
-        <w:rPr>
-          <w:rFonts w:cs="Segoe UI"/>
-          <w:color w:val="1A2634"/>
-          <w:sz w:val="21"/>
-          <w:szCs w:val="21"/>
-        </w:rPr>
-        <w:t>project_description</w:t>
-      </w:r>
-      <w:proofErr w:type="spellEnd"/>
-      <w:r>
-        <w:rPr>
-          <w:rFonts w:cs="Segoe UI"/>
-          <w:color w:val="1A2634"/>
-          <w:sz w:val="21"/>
-          <w:szCs w:val="21"/>
-        </w:rPr>
-        <w:t>}</w:t>
-      </w:r>
-    </w:p>
-    <w:p>
-      <w:pPr>
-        <w:spacing w:after="60" w:line="22" w:lineRule="atLeast"/>
-        <w:rPr>
-          <w:rFonts w:cs="Segoe UI"/>
-          <w:color w:val="1A2634"/>
-          <w:sz w:val="21"/>
-          <w:szCs w:val="21"/>
-        </w:rPr>
-      </w:pPr>
-      <w:r>
-        <w:rPr>
-          <w:rFonts w:cs="Segoe UI"/>
-          <w:color w:val="1A2634"/>
-          <w:sz w:val="21"/>
-          <w:szCs w:val="21"/>
-        </w:rPr>
-        <w:t>{/</w:t>
-      </w:r>
-      <w:proofErr w:type="spellStart"/>
-      <w:r>
-        <w:rPr>
-          <w:rFonts w:cs="Segoe UI"/>
-          <w:color w:val="1A2634"/>
-          <w:sz w:val="21"/>
-          <w:szCs w:val="21"/>
-        </w:rPr>
-        <w:t>project_description</w:t>
-      </w:r>
-      <w:proofErr w:type="spellEnd"/>
-      <w:r>
-        <w:rPr>
-          <w:rFonts w:cs="Segoe UI"/>
-          <w:color w:val="1A2634"/>
-          <w:sz w:val="21"/>
-          <w:szCs w:val="21"/>
-        </w:rPr>
-        <w:t>}</w:t>
+        <w:t>{project_description}</w:t>
+      </w:r>
+    </w:p>
+    <w:p>
+      <w:pPr>
+        <w:spacing w:after="60" w:line="22" w:lineRule="atLeast"/>
+        <w:rPr>
+          <w:rFonts w:cs="Segoe UI"/>
+          <w:color w:val="1A2634"/>
+          <w:sz w:val="21"/>
+          <w:szCs w:val="21"/>
+        </w:rPr>
+      </w:pPr>
+      <w:r>
+        <w:rPr>
+          <w:rFonts w:cs="Segoe UI"/>
+          <w:color w:val="1A2634"/>
+          <w:sz w:val="21"/>
+          <w:szCs w:val="21"/>
+        </w:rPr>
+        <w:t>{/project_description}</w:t>
       </w:r>
     </w:p>
     <w:p>
@@ -878,27 +743,7 @@
           <w:szCs w:val="21"/>
         </w:rPr>
         <w:lastRenderedPageBreak/>
-        <w:t>{/</w:t>
-      </w:r>
-      <w:proofErr w:type="spellStart"/>
-      <w:r>
-        <w:rPr>
-          <w:rFonts w:cs="Segoe UI"/>
-          <w:color w:val="1A2634"/>
-          <w:sz w:val="21"/>
-          <w:szCs w:val="21"/>
-        </w:rPr>
-        <w:t>project_tasks</w:t>
-      </w:r>
-      <w:proofErr w:type="spellEnd"/>
-      <w:r>
-        <w:rPr>
-          <w:rFonts w:cs="Segoe UI"/>
-          <w:color w:val="1A2634"/>
-          <w:sz w:val="21"/>
-          <w:szCs w:val="21"/>
-        </w:rPr>
-        <w:t>}</w:t>
+        <w:t>{/project_tasks}</w:t>
       </w:r>
     </w:p>
     <w:p>
@@ -1060,47 +905,45 @@
           <w:sz w:val="21"/>
           <w:szCs w:val="21"/>
         </w:rPr>
-        <w:t>{#location}, {location}{/location}</w:t>
-      </w:r>
-    </w:p>
-    <w:p>
-      <w:pPr>
-        <w:spacing w:after="60" w:line="22" w:lineRule="atLeast"/>
-        <w:rPr>
-          <w:rFonts w:cs="Segoe UI"/>
-          <w:color w:val="1A2634"/>
-          <w:sz w:val="21"/>
-          <w:szCs w:val="21"/>
-        </w:rPr>
-      </w:pPr>
-      <w:r>
-        <w:rPr>
-          <w:rFonts w:cs="Segoe UI"/>
-          <w:color w:val="1A2634"/>
-          <w:sz w:val="21"/>
-          <w:szCs w:val="21"/>
-        </w:rPr>
-        <w:t>{start} – {</w:t>
-      </w:r>
-      <w:proofErr w:type="spellStart"/>
-      <w:r>
-        <w:rPr>
-          <w:rFonts w:cs="Segoe UI"/>
-          <w:color w:val="1A2634"/>
-          <w:sz w:val="21"/>
-          <w:szCs w:val="21"/>
-        </w:rPr>
-        <w:t>end_or_present</w:t>
-      </w:r>
-      <w:proofErr w:type="spellEnd"/>
-      <w:r>
-        <w:rPr>
-          <w:rFonts w:cs="Segoe UI"/>
-          <w:color w:val="1A2634"/>
-          <w:sz w:val="21"/>
-          <w:szCs w:val="21"/>
-        </w:rPr>
-        <w:t>}</w:t>
+        <w:t>{#location}</w:t>
+      </w:r>
+      <w:r>
+        <w:rPr>
+          <w:rFonts w:cs="Segoe UI"/>
+          <w:color w:val="1A2634"/>
+          <w:sz w:val="21"/>
+          <w:szCs w:val="21"/>
+        </w:rPr>
+        <w:t xml:space="preserve"> |</w:t>
+      </w:r>
+      <w:r>
+        <w:rPr>
+          <w:rFonts w:cs="Segoe UI"/>
+          <w:color w:val="1A2634"/>
+          <w:sz w:val="21"/>
+          <w:szCs w:val="21"/>
+        </w:rPr>
+        <w:t xml:space="preserve"> {location}{/location}</w:t>
+      </w:r>
+    </w:p>
+    <w:p>
+      <w:pPr>
+        <w:spacing w:after="60" w:line="22" w:lineRule="atLeast"/>
+        <w:rPr>
+          <w:rFonts w:cs="Segoe UI"/>
+          <w:color w:val="1A2634"/>
+          <w:sz w:val="21"/>
+          <w:szCs w:val="21"/>
+        </w:rPr>
+      </w:pPr>
+      <w:r>
+        <w:rPr>
+          <w:rFonts w:cs="Segoe UI"/>
+          <w:color w:val="1A2634"/>
+          <w:sz w:val="21"/>
+          <w:szCs w:val="21"/>
+        </w:rPr>
+        <w:t>{start} – {end_or_present}</w:t>
       </w:r>
     </w:p>
     <w:p>
@@ -1140,67 +983,27 @@
           <w:sz w:val="21"/>
           <w:szCs w:val="21"/>
         </w:rPr>
-        <w:t>{</w:t>
-      </w:r>
-      <w:proofErr w:type="spellStart"/>
-      <w:r>
-        <w:rPr>
-          <w:rFonts w:cs="Segoe UI"/>
-          <w:color w:val="1A2634"/>
-          <w:sz w:val="21"/>
-          <w:szCs w:val="21"/>
-        </w:rPr>
-        <w:t>role_summary</w:t>
-      </w:r>
-      <w:proofErr w:type="spellEnd"/>
-      <w:r>
-        <w:rPr>
-          <w:rFonts w:cs="Segoe UI"/>
-          <w:color w:val="1A2634"/>
-          <w:sz w:val="21"/>
-          <w:szCs w:val="21"/>
-        </w:rPr>
-        <w:t>}</w:t>
-      </w:r>
-    </w:p>
-    <w:p>
-      <w:pPr>
-        <w:spacing w:after="60" w:line="22" w:lineRule="atLeast"/>
-        <w:rPr>
-          <w:rFonts w:cs="Segoe UI"/>
-          <w:color w:val="1A2634"/>
-          <w:sz w:val="21"/>
-          <w:szCs w:val="21"/>
-        </w:rPr>
-      </w:pPr>
-      <w:r>
-        <w:rPr>
-          <w:rFonts w:cs="Segoe UI"/>
-          <w:color w:val="1A2634"/>
-          <w:sz w:val="21"/>
-          <w:szCs w:val="21"/>
-        </w:rPr>
-        <w:t>{/</w:t>
-      </w:r>
-      <w:proofErr w:type="spellStart"/>
-      <w:r>
-        <w:rPr>
-          <w:rFonts w:cs="Segoe UI"/>
-          <w:color w:val="1A2634"/>
-          <w:sz w:val="21"/>
-          <w:szCs w:val="21"/>
-        </w:rPr>
-        <w:t>role_summary</w:t>
-      </w:r>
-      <w:proofErr w:type="spellEnd"/>
-      <w:r>
-        <w:rPr>
-          <w:rFonts w:cs="Segoe UI"/>
-          <w:color w:val="1A2634"/>
-          <w:sz w:val="21"/>
-          <w:szCs w:val="21"/>
-        </w:rPr>
-        <w:t>}</w:t>
+        <w:t>{role_summary}</w:t>
+      </w:r>
+    </w:p>
+    <w:p>
+      <w:pPr>
+        <w:spacing w:after="60" w:line="22" w:lineRule="atLeast"/>
+        <w:rPr>
+          <w:rFonts w:cs="Segoe UI"/>
+          <w:color w:val="1A2634"/>
+          <w:sz w:val="21"/>
+          <w:szCs w:val="21"/>
+        </w:rPr>
+      </w:pPr>
+      <w:r>
+        <w:rPr>
+          <w:rFonts w:cs="Segoe UI"/>
+          <w:color w:val="1A2634"/>
+          <w:sz w:val="21"/>
+          <w:szCs w:val="21"/>
+        </w:rPr>
+        <w:t>{/role_summary}</w:t>
       </w:r>
     </w:p>
     <w:p>
@@ -1511,27 +1314,7 @@
           <w:sz w:val="21"/>
           <w:szCs w:val="21"/>
         </w:rPr>
-        <w:t>{</w:t>
-      </w:r>
-      <w:proofErr w:type="spellStart"/>
-      <w:r>
-        <w:rPr>
-          <w:rFonts w:cs="Segoe UI"/>
-          <w:color w:val="1A2634"/>
-          <w:sz w:val="21"/>
-          <w:szCs w:val="21"/>
-        </w:rPr>
-        <w:t>section_title</w:t>
-      </w:r>
-      <w:proofErr w:type="spellEnd"/>
-      <w:r>
-        <w:rPr>
-          <w:rFonts w:cs="Segoe UI"/>
-          <w:color w:val="1A2634"/>
-          <w:sz w:val="21"/>
-          <w:szCs w:val="21"/>
-        </w:rPr>
-        <w:t>}</w:t>
+        <w:t>{section_title}</w:t>
       </w:r>
     </w:p>
     <w:p>
@@ -1631,67 +1414,27 @@
           <w:sz w:val="21"/>
           <w:szCs w:val="21"/>
         </w:rPr>
-        <w:t>{</w:t>
-      </w:r>
-      <w:proofErr w:type="spellStart"/>
-      <w:r>
-        <w:rPr>
-          <w:rFonts w:cs="Segoe UI"/>
-          <w:color w:val="1A2634"/>
-          <w:sz w:val="21"/>
-          <w:szCs w:val="21"/>
-        </w:rPr>
-        <w:t>section_content</w:t>
-      </w:r>
-      <w:proofErr w:type="spellEnd"/>
-      <w:r>
-        <w:rPr>
-          <w:rFonts w:cs="Segoe UI"/>
-          <w:color w:val="1A2634"/>
-          <w:sz w:val="21"/>
-          <w:szCs w:val="21"/>
-        </w:rPr>
-        <w:t>}</w:t>
-      </w:r>
-    </w:p>
-    <w:p>
-      <w:pPr>
-        <w:spacing w:after="60" w:line="22" w:lineRule="atLeast"/>
-        <w:rPr>
-          <w:rFonts w:cs="Segoe UI"/>
-          <w:color w:val="1A2634"/>
-          <w:sz w:val="21"/>
-          <w:szCs w:val="21"/>
-        </w:rPr>
-      </w:pPr>
-      <w:r>
-        <w:rPr>
-          <w:rFonts w:cs="Segoe UI"/>
-          <w:color w:val="1A2634"/>
-          <w:sz w:val="21"/>
-          <w:szCs w:val="21"/>
-        </w:rPr>
-        <w:t>{/</w:t>
-      </w:r>
-      <w:proofErr w:type="spellStart"/>
-      <w:r>
-        <w:rPr>
-          <w:rFonts w:cs="Segoe UI"/>
-          <w:color w:val="1A2634"/>
-          <w:sz w:val="21"/>
-          <w:szCs w:val="21"/>
-        </w:rPr>
-        <w:t>section_content</w:t>
-      </w:r>
-      <w:proofErr w:type="spellEnd"/>
-      <w:r>
-        <w:rPr>
-          <w:rFonts w:cs="Segoe UI"/>
-          <w:color w:val="1A2634"/>
-          <w:sz w:val="21"/>
-          <w:szCs w:val="21"/>
-        </w:rPr>
-        <w:t>}</w:t>
+        <w:t>{section_content}</w:t>
+      </w:r>
+    </w:p>
+    <w:p>
+      <w:pPr>
+        <w:spacing w:after="60" w:line="22" w:lineRule="atLeast"/>
+        <w:rPr>
+          <w:rFonts w:cs="Segoe UI"/>
+          <w:color w:val="1A2634"/>
+          <w:sz w:val="21"/>
+          <w:szCs w:val="21"/>
+        </w:rPr>
+      </w:pPr>
+      <w:r>
+        <w:rPr>
+          <w:rFonts w:cs="Segoe UI"/>
+          <w:color w:val="1A2634"/>
+          <w:sz w:val="21"/>
+          <w:szCs w:val="21"/>
+        </w:rPr>
+        <w:t>{/section_content}</w:t>
       </w:r>
     </w:p>
     <w:p>
@@ -1711,27 +1454,7 @@
           <w:sz w:val="21"/>
           <w:szCs w:val="21"/>
         </w:rPr>
-        <w:t>{/</w:t>
-      </w:r>
-      <w:proofErr w:type="spellStart"/>
-      <w:r>
-        <w:rPr>
-          <w:rFonts w:cs="Segoe UI"/>
-          <w:color w:val="1A2634"/>
-          <w:sz w:val="21"/>
-          <w:szCs w:val="21"/>
-        </w:rPr>
-        <w:t>extra_sections</w:t>
-      </w:r>
-      <w:proofErr w:type="spellEnd"/>
-      <w:r>
-        <w:rPr>
-          <w:rFonts w:cs="Segoe UI"/>
-          <w:color w:val="1A2634"/>
-          <w:sz w:val="21"/>
-          <w:szCs w:val="21"/>
-        </w:rPr>
-        <w:t>}</w:t>
+        <w:t>{/extra_sections}</w:t>
       </w:r>
     </w:p>
     <w:p>
@@ -2261,6 +1984,7 @@
   <w:style w:type="character" w:default="1" w:styleId="DefaultParagraphFont">
     <w:name w:val="Default Paragraph Font"/>
     <w:uiPriority w:val="1"/>
+    <w:semiHidden/>
     <w:unhideWhenUsed/>
   </w:style>
   <w:style w:type="table" w:default="1" w:styleId="TableNormal">

</xml_diff>

<commit_message>
Update CV templates and remove temp files
</commit_message>
<xml_diff>
--- a/templates/template_entry_level.docx
+++ b/templates/template_entry_level.docx
@@ -93,26 +93,6 @@
     </w:p>
     <w:p>
       <w:pPr>
-        <w:spacing w:after="60" w:line="22" w:lineRule="atLeast"/>
-        <w:rPr>
-          <w:rFonts w:cs="Segoe UI"/>
-          <w:color w:val="1A2634"/>
-          <w:sz w:val="21"/>
-          <w:szCs w:val="21"/>
-        </w:rPr>
-      </w:pPr>
-      <w:r>
-        <w:rPr>
-          <w:rFonts w:cs="Segoe UI"/>
-          <w:color w:val="1A2634"/>
-          <w:sz w:val="21"/>
-          <w:szCs w:val="21"/>
-        </w:rPr>
-        <w:t>{#HAS_SKILLS}</w:t>
-      </w:r>
-    </w:p>
-    <w:p>
-      <w:pPr>
         <w:pBdr>
           <w:bottom w:val="single" w:sz="8" w:space="1" w:color="auto"/>
         </w:pBdr>
@@ -140,7 +120,7 @@
     </w:p>
     <w:p>
       <w:pPr>
-        <w:spacing w:after="0" w:line="22" w:lineRule="atLeast"/>
+        <w:spacing w:before="200" w:after="0" w:line="22" w:lineRule="atLeast"/>
         <w:rPr>
           <w:rFonts w:cs="Segoe UI"/>
           <w:color w:val="1A2634"/>
@@ -157,55 +137,45 @@
         </w:rPr>
         <w:t>{#skills}</w:t>
       </w:r>
-      <w:r>
-        <w:rPr>
-          <w:rFonts w:cs="Segoe UI"/>
-          <w:color w:val="1A2634"/>
-          <w:sz w:val="21"/>
-          <w:szCs w:val="21"/>
-        </w:rPr>
-        <w:br/>
+    </w:p>
+    <w:p>
+      <w:pPr>
+        <w:spacing w:before="200" w:after="0" w:line="22" w:lineRule="atLeast"/>
+        <w:rPr>
+          <w:rFonts w:cs="Segoe UI"/>
+          <w:color w:val="1A2634"/>
+          <w:sz w:val="21"/>
+          <w:szCs w:val="21"/>
+        </w:rPr>
+      </w:pPr>
+      <w:r>
+        <w:rPr>
+          <w:rFonts w:cs="Segoe UI"/>
+          <w:color w:val="1A2634"/>
+          <w:sz w:val="21"/>
+          <w:szCs w:val="21"/>
+        </w:rPr>
         <w:t>• {.}</w:t>
       </w:r>
-      <w:r>
-        <w:rPr>
-          <w:rFonts w:cs="Segoe UI"/>
-          <w:color w:val="1A2634"/>
-          <w:sz w:val="21"/>
-          <w:szCs w:val="21"/>
-        </w:rPr>
-        <w:br/>
+    </w:p>
+    <w:p>
+      <w:pPr>
+        <w:spacing w:before="200" w:after="0" w:line="22" w:lineRule="atLeast"/>
+        <w:rPr>
+          <w:rFonts w:cs="Segoe UI"/>
+          <w:color w:val="1A2634"/>
+          <w:sz w:val="21"/>
+          <w:szCs w:val="21"/>
+        </w:rPr>
+      </w:pPr>
+      <w:r>
+        <w:rPr>
+          <w:rFonts w:cs="Segoe UI"/>
+          <w:color w:val="1A2634"/>
+          <w:sz w:val="21"/>
+          <w:szCs w:val="21"/>
+        </w:rPr>
         <w:t>{/skills}</w:t>
-      </w:r>
-      <w:r>
-        <w:rPr>
-          <w:rFonts w:cs="Segoe UI"/>
-          <w:color w:val="1A2634"/>
-          <w:sz w:val="21"/>
-          <w:szCs w:val="21"/>
-        </w:rPr>
-        <w:br/>
-        <w:t>{/HAS_SKILLS}</w:t>
-      </w:r>
-    </w:p>
-    <w:p>
-      <w:pPr>
-        <w:spacing w:after="0" w:line="22" w:lineRule="atLeast"/>
-        <w:rPr>
-          <w:rFonts w:cs="Segoe UI"/>
-          <w:color w:val="1A2634"/>
-          <w:sz w:val="21"/>
-          <w:szCs w:val="21"/>
-        </w:rPr>
-      </w:pPr>
-      <w:r>
-        <w:rPr>
-          <w:rFonts w:cs="Segoe UI"/>
-          <w:color w:val="1A2634"/>
-          <w:sz w:val="21"/>
-          <w:szCs w:val="21"/>
-        </w:rPr>
-        <w:t>{#HAS_EDUCATION}</w:t>
       </w:r>
     </w:p>
     <w:p>
@@ -252,26 +222,6 @@
           <w:sz w:val="21"/>
           <w:szCs w:val="21"/>
         </w:rPr>
-        <w:t>{/HAS_EDUCATION}</w:t>
-      </w:r>
-    </w:p>
-    <w:p>
-      <w:pPr>
-        <w:spacing w:after="60" w:line="22" w:lineRule="atLeast"/>
-        <w:rPr>
-          <w:rFonts w:cs="Segoe UI"/>
-          <w:color w:val="1A2634"/>
-          <w:sz w:val="21"/>
-          <w:szCs w:val="21"/>
-        </w:rPr>
-      </w:pPr>
-      <w:r>
-        <w:rPr>
-          <w:rFonts w:cs="Segoe UI"/>
-          <w:color w:val="1A2634"/>
-          <w:sz w:val="21"/>
-          <w:szCs w:val="21"/>
-        </w:rPr>
         <w:t>{#education}</w:t>
       </w:r>
     </w:p>
@@ -391,7 +341,27 @@
           <w:szCs w:val="21"/>
         </w:rPr>
         <w:br/>
-        <w:t>{/edu_competencies}</w:t>
+        <w:t>{/</w:t>
+      </w:r>
+      <w:proofErr w:type="spellStart"/>
+      <w:r>
+        <w:rPr>
+          <w:rFonts w:cs="Segoe UI"/>
+          <w:color w:val="1A2634"/>
+          <w:sz w:val="21"/>
+          <w:szCs w:val="21"/>
+        </w:rPr>
+        <w:t>edu_competencies</w:t>
+      </w:r>
+      <w:proofErr w:type="spellEnd"/>
+      <w:r>
+        <w:rPr>
+          <w:rFonts w:cs="Segoe UI"/>
+          <w:color w:val="1A2634"/>
+          <w:sz w:val="21"/>
+          <w:szCs w:val="21"/>
+        </w:rPr>
+        <w:t>}</w:t>
       </w:r>
       <w:r>
         <w:rPr>
@@ -420,7 +390,27 @@
           <w:szCs w:val="21"/>
         </w:rPr>
         <w:br/>
-        <w:t>{edu_detail}</w:t>
+        <w:t>{</w:t>
+      </w:r>
+      <w:proofErr w:type="spellStart"/>
+      <w:r>
+        <w:rPr>
+          <w:rFonts w:cs="Segoe UI"/>
+          <w:color w:val="1A2634"/>
+          <w:sz w:val="21"/>
+          <w:szCs w:val="21"/>
+        </w:rPr>
+        <w:t>edu_detail</w:t>
+      </w:r>
+      <w:proofErr w:type="spellEnd"/>
+      <w:r>
+        <w:rPr>
+          <w:rFonts w:cs="Segoe UI"/>
+          <w:color w:val="1A2634"/>
+          <w:sz w:val="21"/>
+          <w:szCs w:val="21"/>
+        </w:rPr>
+        <w:t>}</w:t>
       </w:r>
       <w:r>
         <w:rPr>
@@ -430,7 +420,27 @@
           <w:szCs w:val="21"/>
         </w:rPr>
         <w:br/>
-        <w:t>{/edu_detail}</w:t>
+        <w:t>{/</w:t>
+      </w:r>
+      <w:proofErr w:type="spellStart"/>
+      <w:r>
+        <w:rPr>
+          <w:rFonts w:cs="Segoe UI"/>
+          <w:color w:val="1A2634"/>
+          <w:sz w:val="21"/>
+          <w:szCs w:val="21"/>
+        </w:rPr>
+        <w:t>edu_detail</w:t>
+      </w:r>
+      <w:proofErr w:type="spellEnd"/>
+      <w:r>
+        <w:rPr>
+          <w:rFonts w:cs="Segoe UI"/>
+          <w:color w:val="1A2634"/>
+          <w:sz w:val="21"/>
+          <w:szCs w:val="21"/>
+        </w:rPr>
+        <w:t>}</w:t>
       </w:r>
       <w:r>
         <w:rPr>
@@ -462,26 +472,6 @@
           <w:szCs w:val="21"/>
         </w:rPr>
       </w:pPr>
-    </w:p>
-    <w:p>
-      <w:pPr>
-        <w:spacing w:after="0" w:line="22" w:lineRule="atLeast"/>
-        <w:rPr>
-          <w:rFonts w:cs="Segoe UI"/>
-          <w:color w:val="1A2634"/>
-          <w:sz w:val="21"/>
-          <w:szCs w:val="21"/>
-        </w:rPr>
-      </w:pPr>
-      <w:r>
-        <w:rPr>
-          <w:rFonts w:cs="Segoe UI"/>
-          <w:color w:val="1A2634"/>
-          <w:sz w:val="21"/>
-          <w:szCs w:val="21"/>
-        </w:rPr>
-        <w:t>{#HAS_PROJECTS}</w:t>
-      </w:r>
     </w:p>
     <w:p>
       <w:pPr>
@@ -549,26 +539,6 @@
           <w:sz w:val="21"/>
           <w:szCs w:val="21"/>
         </w:rPr>
-        <w:t>{/HAS_PROJECTS}</w:t>
-      </w:r>
-    </w:p>
-    <w:p>
-      <w:pPr>
-        <w:spacing w:after="60" w:line="22" w:lineRule="atLeast"/>
-        <w:rPr>
-          <w:rFonts w:cs="Segoe UI"/>
-          <w:color w:val="1A2634"/>
-          <w:sz w:val="21"/>
-          <w:szCs w:val="21"/>
-        </w:rPr>
-      </w:pPr>
-      <w:r>
-        <w:rPr>
-          <w:rFonts w:cs="Segoe UI"/>
-          <w:color w:val="1A2634"/>
-          <w:sz w:val="21"/>
-          <w:szCs w:val="21"/>
-        </w:rPr>
         <w:t>{#projects}</w:t>
       </w:r>
     </w:p>
@@ -593,27 +563,51 @@
           <w:sz w:val="21"/>
           <w:szCs w:val="21"/>
         </w:rPr>
-        <w:t>{project_title}</w:t>
-      </w:r>
-    </w:p>
-    <w:p>
-      <w:pPr>
-        <w:spacing w:after="60" w:line="22" w:lineRule="atLeast"/>
-        <w:rPr>
-          <w:rFonts w:cs="Segoe UI"/>
-          <w:color w:val="1A2634"/>
-          <w:sz w:val="21"/>
-          <w:szCs w:val="21"/>
-        </w:rPr>
-      </w:pPr>
-      <w:r>
-        <w:rPr>
-          <w:rFonts w:cs="Segoe UI"/>
-          <w:color w:val="1A2634"/>
-          <w:sz w:val="21"/>
-          <w:szCs w:val="21"/>
-        </w:rPr>
-        <w:t>{start} – {end_or_present}</w:t>
+        <w:t>{</w:t>
+      </w:r>
+      <w:proofErr w:type="spellStart"/>
+      <w:r>
+        <w:rPr>
+          <w:rFonts w:cs="Segoe UI"/>
+          <w:b/>
+          <w:bCs/>
+          <w:color w:val="1A2634"/>
+          <w:sz w:val="21"/>
+          <w:szCs w:val="21"/>
+        </w:rPr>
+        <w:t>project_title</w:t>
+      </w:r>
+      <w:proofErr w:type="spellEnd"/>
+      <w:r>
+        <w:rPr>
+          <w:rFonts w:cs="Segoe UI"/>
+          <w:b/>
+          <w:bCs/>
+          <w:color w:val="1A2634"/>
+          <w:sz w:val="21"/>
+          <w:szCs w:val="21"/>
+        </w:rPr>
+        <w:t>}</w:t>
+      </w:r>
+    </w:p>
+    <w:p>
+      <w:pPr>
+        <w:spacing w:after="60" w:line="22" w:lineRule="atLeast"/>
+        <w:rPr>
+          <w:rFonts w:cs="Segoe UI"/>
+          <w:color w:val="1A2634"/>
+          <w:sz w:val="21"/>
+          <w:szCs w:val="21"/>
+        </w:rPr>
+      </w:pPr>
+      <w:r>
+        <w:rPr>
+          <w:rFonts w:cs="Segoe UI"/>
+          <w:color w:val="1A2634"/>
+          <w:sz w:val="21"/>
+          <w:szCs w:val="21"/>
+        </w:rPr>
+        <w:t>{start} – {end}</w:t>
       </w:r>
     </w:p>
     <w:p>
@@ -653,27 +647,67 @@
           <w:sz w:val="21"/>
           <w:szCs w:val="21"/>
         </w:rPr>
-        <w:t>{project_description}</w:t>
-      </w:r>
-    </w:p>
-    <w:p>
-      <w:pPr>
-        <w:spacing w:after="60" w:line="22" w:lineRule="atLeast"/>
-        <w:rPr>
-          <w:rFonts w:cs="Segoe UI"/>
-          <w:color w:val="1A2634"/>
-          <w:sz w:val="21"/>
-          <w:szCs w:val="21"/>
-        </w:rPr>
-      </w:pPr>
-      <w:r>
-        <w:rPr>
-          <w:rFonts w:cs="Segoe UI"/>
-          <w:color w:val="1A2634"/>
-          <w:sz w:val="21"/>
-          <w:szCs w:val="21"/>
-        </w:rPr>
-        <w:t>{/project_description}</w:t>
+        <w:t>{</w:t>
+      </w:r>
+      <w:proofErr w:type="spellStart"/>
+      <w:r>
+        <w:rPr>
+          <w:rFonts w:cs="Segoe UI"/>
+          <w:color w:val="1A2634"/>
+          <w:sz w:val="21"/>
+          <w:szCs w:val="21"/>
+        </w:rPr>
+        <w:t>project_description</w:t>
+      </w:r>
+      <w:proofErr w:type="spellEnd"/>
+      <w:r>
+        <w:rPr>
+          <w:rFonts w:cs="Segoe UI"/>
+          <w:color w:val="1A2634"/>
+          <w:sz w:val="21"/>
+          <w:szCs w:val="21"/>
+        </w:rPr>
+        <w:t>}</w:t>
+      </w:r>
+    </w:p>
+    <w:p>
+      <w:pPr>
+        <w:spacing w:after="60" w:line="22" w:lineRule="atLeast"/>
+        <w:rPr>
+          <w:rFonts w:cs="Segoe UI"/>
+          <w:color w:val="1A2634"/>
+          <w:sz w:val="21"/>
+          <w:szCs w:val="21"/>
+        </w:rPr>
+      </w:pPr>
+      <w:r>
+        <w:rPr>
+          <w:rFonts w:cs="Segoe UI"/>
+          <w:color w:val="1A2634"/>
+          <w:sz w:val="21"/>
+          <w:szCs w:val="21"/>
+        </w:rPr>
+        <w:t>{/</w:t>
+      </w:r>
+      <w:proofErr w:type="spellStart"/>
+      <w:r>
+        <w:rPr>
+          <w:rFonts w:cs="Segoe UI"/>
+          <w:color w:val="1A2634"/>
+          <w:sz w:val="21"/>
+          <w:szCs w:val="21"/>
+        </w:rPr>
+        <w:t>project_description</w:t>
+      </w:r>
+      <w:proofErr w:type="spellEnd"/>
+      <w:r>
+        <w:rPr>
+          <w:rFonts w:cs="Segoe UI"/>
+          <w:color w:val="1A2634"/>
+          <w:sz w:val="21"/>
+          <w:szCs w:val="21"/>
+        </w:rPr>
+        <w:t>}</w:t>
       </w:r>
     </w:p>
     <w:p>
@@ -742,8 +776,27 @@
           <w:sz w:val="21"/>
           <w:szCs w:val="21"/>
         </w:rPr>
-        <w:lastRenderedPageBreak/>
-        <w:t>{/project_tasks}</w:t>
+        <w:t>{/</w:t>
+      </w:r>
+      <w:proofErr w:type="spellStart"/>
+      <w:r>
+        <w:rPr>
+          <w:rFonts w:cs="Segoe UI"/>
+          <w:color w:val="1A2634"/>
+          <w:sz w:val="21"/>
+          <w:szCs w:val="21"/>
+        </w:rPr>
+        <w:t>project_tasks</w:t>
+      </w:r>
+      <w:proofErr w:type="spellEnd"/>
+      <w:r>
+        <w:rPr>
+          <w:rFonts w:cs="Segoe UI"/>
+          <w:color w:val="1A2634"/>
+          <w:sz w:val="21"/>
+          <w:szCs w:val="21"/>
+        </w:rPr>
+        <w:t>}</w:t>
       </w:r>
     </w:p>
     <w:p>
@@ -764,26 +817,6 @@
           <w:szCs w:val="21"/>
         </w:rPr>
         <w:t>{/projects}</w:t>
-      </w:r>
-    </w:p>
-    <w:p>
-      <w:pPr>
-        <w:spacing w:after="0" w:line="22" w:lineRule="atLeast"/>
-        <w:rPr>
-          <w:rFonts w:cs="Segoe UI"/>
-          <w:color w:val="1A2634"/>
-          <w:sz w:val="21"/>
-          <w:szCs w:val="21"/>
-        </w:rPr>
-      </w:pPr>
-      <w:r>
-        <w:rPr>
-          <w:rFonts w:cs="Segoe UI"/>
-          <w:color w:val="1A2634"/>
-          <w:sz w:val="21"/>
-          <w:szCs w:val="21"/>
-        </w:rPr>
-        <w:t>{#HAS_EXPERIENCE}</w:t>
       </w:r>
     </w:p>
     <w:p>
@@ -830,26 +863,6 @@
           <w:sz w:val="21"/>
           <w:szCs w:val="21"/>
         </w:rPr>
-        <w:t>{/HAS_EXPERIENCE}</w:t>
-      </w:r>
-    </w:p>
-    <w:p>
-      <w:pPr>
-        <w:spacing w:after="60" w:line="22" w:lineRule="atLeast"/>
-        <w:rPr>
-          <w:rFonts w:cs="Segoe UI"/>
-          <w:color w:val="1A2634"/>
-          <w:sz w:val="21"/>
-          <w:szCs w:val="21"/>
-        </w:rPr>
-      </w:pPr>
-      <w:r>
-        <w:rPr>
-          <w:rFonts w:cs="Segoe UI"/>
-          <w:color w:val="1A2634"/>
-          <w:sz w:val="21"/>
-          <w:szCs w:val="21"/>
-        </w:rPr>
         <w:t>{#experience}</w:t>
       </w:r>
     </w:p>
@@ -874,6 +887,7 @@
           <w:sz w:val="21"/>
           <w:szCs w:val="21"/>
         </w:rPr>
+        <w:lastRenderedPageBreak/>
         <w:t>{title}</w:t>
       </w:r>
     </w:p>
@@ -943,7 +957,7 @@
           <w:sz w:val="21"/>
           <w:szCs w:val="21"/>
         </w:rPr>
-        <w:t>{start} – {end_or_present}</w:t>
+        <w:t>{start} – {end}</w:t>
       </w:r>
     </w:p>
     <w:p>
@@ -983,27 +997,67 @@
           <w:sz w:val="21"/>
           <w:szCs w:val="21"/>
         </w:rPr>
-        <w:t>{role_summary}</w:t>
-      </w:r>
-    </w:p>
-    <w:p>
-      <w:pPr>
-        <w:spacing w:after="60" w:line="22" w:lineRule="atLeast"/>
-        <w:rPr>
-          <w:rFonts w:cs="Segoe UI"/>
-          <w:color w:val="1A2634"/>
-          <w:sz w:val="21"/>
-          <w:szCs w:val="21"/>
-        </w:rPr>
-      </w:pPr>
-      <w:r>
-        <w:rPr>
-          <w:rFonts w:cs="Segoe UI"/>
-          <w:color w:val="1A2634"/>
-          <w:sz w:val="21"/>
-          <w:szCs w:val="21"/>
-        </w:rPr>
-        <w:t>{/role_summary}</w:t>
+        <w:t>{</w:t>
+      </w:r>
+      <w:proofErr w:type="spellStart"/>
+      <w:r>
+        <w:rPr>
+          <w:rFonts w:cs="Segoe UI"/>
+          <w:color w:val="1A2634"/>
+          <w:sz w:val="21"/>
+          <w:szCs w:val="21"/>
+        </w:rPr>
+        <w:t>role_summary</w:t>
+      </w:r>
+      <w:proofErr w:type="spellEnd"/>
+      <w:r>
+        <w:rPr>
+          <w:rFonts w:cs="Segoe UI"/>
+          <w:color w:val="1A2634"/>
+          <w:sz w:val="21"/>
+          <w:szCs w:val="21"/>
+        </w:rPr>
+        <w:t>}</w:t>
+      </w:r>
+    </w:p>
+    <w:p>
+      <w:pPr>
+        <w:spacing w:after="60" w:line="22" w:lineRule="atLeast"/>
+        <w:rPr>
+          <w:rFonts w:cs="Segoe UI"/>
+          <w:color w:val="1A2634"/>
+          <w:sz w:val="21"/>
+          <w:szCs w:val="21"/>
+        </w:rPr>
+      </w:pPr>
+      <w:r>
+        <w:rPr>
+          <w:rFonts w:cs="Segoe UI"/>
+          <w:color w:val="1A2634"/>
+          <w:sz w:val="21"/>
+          <w:szCs w:val="21"/>
+        </w:rPr>
+        <w:t>{/</w:t>
+      </w:r>
+      <w:proofErr w:type="spellStart"/>
+      <w:r>
+        <w:rPr>
+          <w:rFonts w:cs="Segoe UI"/>
+          <w:color w:val="1A2634"/>
+          <w:sz w:val="21"/>
+          <w:szCs w:val="21"/>
+        </w:rPr>
+        <w:t>role_summary</w:t>
+      </w:r>
+      <w:proofErr w:type="spellEnd"/>
+      <w:r>
+        <w:rPr>
+          <w:rFonts w:cs="Segoe UI"/>
+          <w:color w:val="1A2634"/>
+          <w:sz w:val="21"/>
+          <w:szCs w:val="21"/>
+        </w:rPr>
+        <w:t>}</w:t>
       </w:r>
     </w:p>
     <w:p>
@@ -1093,26 +1147,6 @@
           <w:szCs w:val="21"/>
         </w:rPr>
         <w:t>{/experience}</w:t>
-      </w:r>
-    </w:p>
-    <w:p>
-      <w:pPr>
-        <w:spacing w:after="0" w:line="22" w:lineRule="atLeast"/>
-        <w:rPr>
-          <w:rFonts w:cs="Segoe UI"/>
-          <w:color w:val="1A2634"/>
-          <w:sz w:val="21"/>
-          <w:szCs w:val="21"/>
-        </w:rPr>
-      </w:pPr>
-      <w:r>
-        <w:rPr>
-          <w:rFonts w:cs="Segoe UI"/>
-          <w:color w:val="1A2634"/>
-          <w:sz w:val="21"/>
-          <w:szCs w:val="21"/>
-        </w:rPr>
-        <w:t>{#HAS_CERTIFICATIONS}</w:t>
       </w:r>
     </w:p>
     <w:p>
@@ -1159,26 +1193,6 @@
           <w:sz w:val="21"/>
           <w:szCs w:val="21"/>
         </w:rPr>
-        <w:t>{/HAS_CERTIFICATIONS}</w:t>
-      </w:r>
-    </w:p>
-    <w:p>
-      <w:pPr>
-        <w:spacing w:after="60" w:line="22" w:lineRule="atLeast"/>
-        <w:rPr>
-          <w:rFonts w:cs="Segoe UI"/>
-          <w:color w:val="1A2634"/>
-          <w:sz w:val="21"/>
-          <w:szCs w:val="21"/>
-        </w:rPr>
-      </w:pPr>
-      <w:r>
-        <w:rPr>
-          <w:rFonts w:cs="Segoe UI"/>
-          <w:color w:val="1A2634"/>
-          <w:sz w:val="21"/>
-          <w:szCs w:val="21"/>
-        </w:rPr>
         <w:t>{#certifications}</w:t>
       </w:r>
     </w:p>
@@ -1208,26 +1222,6 @@
           <w:szCs w:val="21"/>
         </w:rPr>
         <w:t>{/certifications}</w:t>
-      </w:r>
-    </w:p>
-    <w:p>
-      <w:pPr>
-        <w:spacing w:after="0" w:line="22" w:lineRule="atLeast"/>
-        <w:rPr>
-          <w:rFonts w:cs="Segoe UI"/>
-          <w:color w:val="1A2634"/>
-          <w:sz w:val="21"/>
-          <w:szCs w:val="21"/>
-        </w:rPr>
-      </w:pPr>
-      <w:r>
-        <w:rPr>
-          <w:rFonts w:cs="Segoe UI"/>
-          <w:color w:val="1A2634"/>
-          <w:sz w:val="21"/>
-          <w:szCs w:val="21"/>
-        </w:rPr>
-        <w:t>{#HAS_EXTRA}</w:t>
       </w:r>
     </w:p>
     <w:p>
@@ -1274,26 +1268,6 @@
           <w:sz w:val="21"/>
           <w:szCs w:val="21"/>
         </w:rPr>
-        <w:t>{/HAS_EXTRA}</w:t>
-      </w:r>
-    </w:p>
-    <w:p>
-      <w:pPr>
-        <w:spacing w:after="60" w:line="22" w:lineRule="atLeast"/>
-        <w:rPr>
-          <w:rFonts w:cs="Segoe UI"/>
-          <w:color w:val="1A2634"/>
-          <w:sz w:val="21"/>
-          <w:szCs w:val="21"/>
-        </w:rPr>
-      </w:pPr>
-      <w:r>
-        <w:rPr>
-          <w:rFonts w:cs="Segoe UI"/>
-          <w:color w:val="1A2634"/>
-          <w:sz w:val="21"/>
-          <w:szCs w:val="21"/>
-        </w:rPr>
         <w:t>{#extra_sections}</w:t>
       </w:r>
     </w:p>
@@ -1314,7 +1288,27 @@
           <w:sz w:val="21"/>
           <w:szCs w:val="21"/>
         </w:rPr>
-        <w:t>{section_title}</w:t>
+        <w:t>{</w:t>
+      </w:r>
+      <w:proofErr w:type="spellStart"/>
+      <w:r>
+        <w:rPr>
+          <w:rFonts w:cs="Segoe UI"/>
+          <w:color w:val="1A2634"/>
+          <w:sz w:val="21"/>
+          <w:szCs w:val="21"/>
+        </w:rPr>
+        <w:t>section_title</w:t>
+      </w:r>
+      <w:proofErr w:type="spellEnd"/>
+      <w:r>
+        <w:rPr>
+          <w:rFonts w:cs="Segoe UI"/>
+          <w:color w:val="1A2634"/>
+          <w:sz w:val="21"/>
+          <w:szCs w:val="21"/>
+        </w:rPr>
+        <w:t>}</w:t>
       </w:r>
     </w:p>
     <w:p>
@@ -1414,27 +1408,67 @@
           <w:sz w:val="21"/>
           <w:szCs w:val="21"/>
         </w:rPr>
-        <w:t>{section_content}</w:t>
-      </w:r>
-    </w:p>
-    <w:p>
-      <w:pPr>
-        <w:spacing w:after="60" w:line="22" w:lineRule="atLeast"/>
-        <w:rPr>
-          <w:rFonts w:cs="Segoe UI"/>
-          <w:color w:val="1A2634"/>
-          <w:sz w:val="21"/>
-          <w:szCs w:val="21"/>
-        </w:rPr>
-      </w:pPr>
-      <w:r>
-        <w:rPr>
-          <w:rFonts w:cs="Segoe UI"/>
-          <w:color w:val="1A2634"/>
-          <w:sz w:val="21"/>
-          <w:szCs w:val="21"/>
-        </w:rPr>
-        <w:t>{/section_content}</w:t>
+        <w:t>{</w:t>
+      </w:r>
+      <w:proofErr w:type="spellStart"/>
+      <w:r>
+        <w:rPr>
+          <w:rFonts w:cs="Segoe UI"/>
+          <w:color w:val="1A2634"/>
+          <w:sz w:val="21"/>
+          <w:szCs w:val="21"/>
+        </w:rPr>
+        <w:t>section_content</w:t>
+      </w:r>
+      <w:proofErr w:type="spellEnd"/>
+      <w:r>
+        <w:rPr>
+          <w:rFonts w:cs="Segoe UI"/>
+          <w:color w:val="1A2634"/>
+          <w:sz w:val="21"/>
+          <w:szCs w:val="21"/>
+        </w:rPr>
+        <w:t>}</w:t>
+      </w:r>
+    </w:p>
+    <w:p>
+      <w:pPr>
+        <w:spacing w:after="60" w:line="22" w:lineRule="atLeast"/>
+        <w:rPr>
+          <w:rFonts w:cs="Segoe UI"/>
+          <w:color w:val="1A2634"/>
+          <w:sz w:val="21"/>
+          <w:szCs w:val="21"/>
+        </w:rPr>
+      </w:pPr>
+      <w:r>
+        <w:rPr>
+          <w:rFonts w:cs="Segoe UI"/>
+          <w:color w:val="1A2634"/>
+          <w:sz w:val="21"/>
+          <w:szCs w:val="21"/>
+        </w:rPr>
+        <w:t>{/</w:t>
+      </w:r>
+      <w:proofErr w:type="spellStart"/>
+      <w:r>
+        <w:rPr>
+          <w:rFonts w:cs="Segoe UI"/>
+          <w:color w:val="1A2634"/>
+          <w:sz w:val="21"/>
+          <w:szCs w:val="21"/>
+        </w:rPr>
+        <w:t>section_content</w:t>
+      </w:r>
+      <w:proofErr w:type="spellEnd"/>
+      <w:r>
+        <w:rPr>
+          <w:rFonts w:cs="Segoe UI"/>
+          <w:color w:val="1A2634"/>
+          <w:sz w:val="21"/>
+          <w:szCs w:val="21"/>
+        </w:rPr>
+        <w:t>}</w:t>
       </w:r>
     </w:p>
     <w:p>
@@ -1454,32 +1488,32 @@
           <w:sz w:val="21"/>
           <w:szCs w:val="21"/>
         </w:rPr>
-        <w:t>{/extra_sections}</w:t>
-      </w:r>
-    </w:p>
-    <w:p>
-      <w:pPr>
-        <w:spacing w:after="60" w:line="22" w:lineRule="atLeast"/>
-        <w:rPr>
-          <w:rFonts w:cs="Segoe UI"/>
-          <w:color w:val="1A2634"/>
-          <w:sz w:val="21"/>
-          <w:szCs w:val="21"/>
-        </w:rPr>
-      </w:pPr>
-      <w:r>
-        <w:rPr>
-          <w:rFonts w:cs="Segoe UI"/>
-          <w:color w:val="1A2634"/>
-          <w:sz w:val="21"/>
-          <w:szCs w:val="21"/>
-        </w:rPr>
-        <w:t>{/HAS_EXTRA}</w:t>
-      </w:r>
-    </w:p>
-    <w:p>
-      <w:pPr>
-        <w:spacing w:after="0" w:line="22" w:lineRule="atLeast"/>
+        <w:t>{/</w:t>
+      </w:r>
+      <w:proofErr w:type="spellStart"/>
+      <w:r>
+        <w:rPr>
+          <w:rFonts w:cs="Segoe UI"/>
+          <w:color w:val="1A2634"/>
+          <w:sz w:val="21"/>
+          <w:szCs w:val="21"/>
+        </w:rPr>
+        <w:t>extra_sections</w:t>
+      </w:r>
+      <w:proofErr w:type="spellEnd"/>
+      <w:r>
+        <w:rPr>
+          <w:rFonts w:cs="Segoe UI"/>
+          <w:color w:val="1A2634"/>
+          <w:sz w:val="21"/>
+          <w:szCs w:val="21"/>
+        </w:rPr>
+        <w:t>}</w:t>
+      </w:r>
+    </w:p>
+    <w:p>
+      <w:pPr>
+        <w:spacing w:before="200" w:after="0" w:line="22" w:lineRule="atLeast"/>
         <w:rPr>
           <w:rFonts w:cs="Segoe UI"/>
           <w:color w:val="1A2634"/>
@@ -1564,7 +1598,6 @@
         <w:t>{/HAS_REFERENCE}</w:t>
       </w:r>
     </w:p>
-    <w:p/>
     <w:sectPr>
       <w:pgSz w:w="11909" w:h="16834" w:code="9"/>
       <w:pgMar w:top="1440" w:right="1152" w:bottom="1152" w:left="1440" w:header="720" w:footer="720" w:gutter="0"/>

</xml_diff>

<commit_message>
Fix dynamic CV template ordering logic for entry and professional CVs
</commit_message>
<xml_diff>
--- a/templates/template_entry_level.docx
+++ b/templates/template_entry_level.docx
@@ -310,6 +310,46 @@
     </w:p>
     <w:p>
       <w:pPr>
+        <w:spacing w:after="60" w:line="22" w:lineRule="atLeast"/>
+        <w:rPr>
+          <w:rFonts w:cs="Segoe UI"/>
+          <w:color w:val="1A2634"/>
+          <w:sz w:val="21"/>
+          <w:szCs w:val="21"/>
+        </w:rPr>
+      </w:pPr>
+      <w:r>
+        <w:rPr>
+          <w:rFonts w:cs="Segoe UI"/>
+          <w:color w:val="1A2634"/>
+          <w:sz w:val="21"/>
+          <w:szCs w:val="21"/>
+        </w:rPr>
+        <w:t>{start} – {</w:t>
+      </w:r>
+      <w:proofErr w:type="spellStart"/>
+      <w:r>
+        <w:rPr>
+          <w:rFonts w:cs="Segoe UI"/>
+          <w:color w:val="1A2634"/>
+          <w:sz w:val="21"/>
+          <w:szCs w:val="21"/>
+        </w:rPr>
+        <w:t>end_or_present</w:t>
+      </w:r>
+      <w:proofErr w:type="spellEnd"/>
+      <w:r>
+        <w:rPr>
+          <w:rFonts w:cs="Segoe UI"/>
+          <w:color w:val="1A2634"/>
+          <w:sz w:val="21"/>
+          <w:szCs w:val="21"/>
+        </w:rPr>
+        <w:t>}</w:t>
+      </w:r>
+    </w:p>
+    <w:p>
+      <w:pPr>
         <w:spacing w:after="0" w:line="22" w:lineRule="atLeast"/>
         <w:rPr>
           <w:rFonts w:cs="Segoe UI"/>
@@ -464,28 +504,8 @@
           <w:szCs w:val="21"/>
         </w:rPr>
         <w:br/>
-      </w:r>
-      <w:r>
-        <w:rPr>
-          <w:rFonts w:cs="Segoe UI"/>
-          <w:color w:val="1A2634"/>
-          <w:sz w:val="21"/>
-          <w:szCs w:val="21"/>
-        </w:rPr>
-        <w:br/>
         <w:t>{/education}</w:t>
       </w:r>
-    </w:p>
-    <w:p>
-      <w:pPr>
-        <w:spacing w:after="0" w:line="22" w:lineRule="atLeast"/>
-        <w:rPr>
-          <w:rFonts w:cs="Segoe UI"/>
-          <w:color w:val="1A2634"/>
-          <w:sz w:val="21"/>
-          <w:szCs w:val="21"/>
-        </w:rPr>
-      </w:pPr>
     </w:p>
     <w:p>
       <w:pPr>
@@ -628,7 +648,47 @@
           <w:sz w:val="21"/>
           <w:szCs w:val="21"/>
         </w:rPr>
-        <w:t>{start} – {end}</w:t>
+        <w:t>{start} – {</w:t>
+      </w:r>
+      <w:proofErr w:type="spellStart"/>
+      <w:r>
+        <w:rPr>
+          <w:rFonts w:cs="Segoe UI"/>
+          <w:color w:val="1A2634"/>
+          <w:sz w:val="21"/>
+          <w:szCs w:val="21"/>
+        </w:rPr>
+        <w:t>end_or_present</w:t>
+      </w:r>
+      <w:proofErr w:type="spellEnd"/>
+      <w:r>
+        <w:rPr>
+          <w:rFonts w:cs="Segoe UI"/>
+          <w:color w:val="1A2634"/>
+          <w:sz w:val="21"/>
+          <w:szCs w:val="21"/>
+        </w:rPr>
+        <w:t>}</w:t>
+      </w:r>
+    </w:p>
+    <w:p>
+      <w:pPr>
+        <w:spacing w:after="60" w:line="22" w:lineRule="atLeast"/>
+        <w:rPr>
+          <w:rFonts w:cs="Segoe UI"/>
+          <w:color w:val="1A2634"/>
+          <w:sz w:val="21"/>
+          <w:szCs w:val="21"/>
+        </w:rPr>
+      </w:pPr>
+      <w:r>
+        <w:rPr>
+          <w:rFonts w:cs="Segoe UI"/>
+          <w:color w:val="1A2634"/>
+          <w:sz w:val="21"/>
+          <w:szCs w:val="21"/>
+        </w:rPr>
+        <w:t>{#project_description}</w:t>
       </w:r>
     </w:p>
     <w:p>
@@ -649,26 +709,6 @@
           <w:szCs w:val="21"/>
         </w:rPr>
         <w:lastRenderedPageBreak/>
-        <w:t>{#project_description}</w:t>
-      </w:r>
-    </w:p>
-    <w:p>
-      <w:pPr>
-        <w:spacing w:after="60" w:line="22" w:lineRule="atLeast"/>
-        <w:rPr>
-          <w:rFonts w:cs="Segoe UI"/>
-          <w:color w:val="1A2634"/>
-          <w:sz w:val="21"/>
-          <w:szCs w:val="21"/>
-        </w:rPr>
-      </w:pPr>
-      <w:r>
-        <w:rPr>
-          <w:rFonts w:cs="Segoe UI"/>
-          <w:color w:val="1A2634"/>
-          <w:sz w:val="21"/>
-          <w:szCs w:val="21"/>
-        </w:rPr>
         <w:t>{</w:t>
       </w:r>
       <w:proofErr w:type="spellStart"/>
@@ -985,7 +1025,27 @@
           <w:sz w:val="21"/>
           <w:szCs w:val="21"/>
         </w:rPr>
-        <w:t>{start} – {end}</w:t>
+        <w:t>{start} – {</w:t>
+      </w:r>
+      <w:proofErr w:type="spellStart"/>
+      <w:r>
+        <w:rPr>
+          <w:rFonts w:cs="Segoe UI"/>
+          <w:color w:val="1A2634"/>
+          <w:sz w:val="21"/>
+          <w:szCs w:val="21"/>
+        </w:rPr>
+        <w:t>end_or_present</w:t>
+      </w:r>
+      <w:proofErr w:type="spellEnd"/>
+      <w:r>
+        <w:rPr>
+          <w:rFonts w:cs="Segoe UI"/>
+          <w:color w:val="1A2634"/>
+          <w:sz w:val="21"/>
+          <w:szCs w:val="21"/>
+        </w:rPr>
+        <w:t>}</w:t>
       </w:r>
     </w:p>
     <w:p>
@@ -1563,6 +1623,7 @@
           <w:szCs w:val="21"/>
         </w:rPr>
       </w:pPr>
+      <w:bookmarkStart w:id="0" w:name="_Hlk230844847"/>
       <w:r>
         <w:rPr>
           <w:rFonts w:cs="Segoe UI"/>
@@ -1631,6 +1692,62 @@
         </w:rPr>
       </w:pPr>
       <w:r>
+        <w:t>{#references_list}</w:t>
+      </w:r>
+      <w:r>
+        <w:br/>
+        <w:t>{name}</w:t>
+      </w:r>
+      <w:r>
+        <w:br/>
+        <w:t>{position}</w:t>
+      </w:r>
+      <w:r>
+        <w:t xml:space="preserve">, </w:t>
+      </w:r>
+      <w:r>
+        <w:t>{organization}</w:t>
+      </w:r>
+      <w:r>
+        <w:t xml:space="preserve">, </w:t>
+      </w:r>
+      <w:r>
+        <w:t>{location}</w:t>
+      </w:r>
+      <w:r>
+        <w:br/>
+        <w:t>{email}</w:t>
+      </w:r>
+      <w:r>
+        <w:t xml:space="preserve">, </w:t>
+      </w:r>
+      <w:r>
+        <w:t>{phone}</w:t>
+      </w:r>
+      <w:r>
+        <w:br/>
+        <w:t>{/</w:t>
+      </w:r>
+      <w:proofErr w:type="spellStart"/>
+      <w:r>
+        <w:t>references_list</w:t>
+      </w:r>
+      <w:proofErr w:type="spellEnd"/>
+      <w:r>
+        <w:t>}</w:t>
+      </w:r>
+    </w:p>
+    <w:p>
+      <w:pPr>
+        <w:spacing w:after="60" w:line="22" w:lineRule="atLeast"/>
+        <w:rPr>
+          <w:rFonts w:cs="Segoe UI"/>
+          <w:color w:val="1A2634"/>
+          <w:sz w:val="21"/>
+          <w:szCs w:val="21"/>
+        </w:rPr>
+      </w:pPr>
+      <w:r>
         <w:rPr>
           <w:rFonts w:cs="Segoe UI"/>
           <w:color w:val="1A2634"/>
@@ -1639,6 +1756,7 @@
         </w:rPr>
         <w:t>{/HAS_REFERENCE}</w:t>
       </w:r>
+      <w:bookmarkEnd w:id="0"/>
     </w:p>
     <w:sectPr>
       <w:pgSz w:w="11909" w:h="16834" w:code="9"/>

</xml_diff>